<commit_message>
Align Lab 02 manual with slide metrics and deliverables
</commit_message>
<xml_diff>
--- a/lab_02/Lab02_Student_Manual_TH.docx
+++ b/lab_02/Lab02_Student_Manual_TH.docx
@@ -71,7 +71,13 @@
     <w:p>
       <w:pPr/>
       <w:r>
-        <w:t>ทำงานในโฟลเดอร์ labs/lab02_robust_reactive_lamp โดยใช้ lab02.py, student_controller.py, plot_trial.py, requirements.txt และ tests/test_lab02.py</w:t>
+        <w:t>ทำงานในโฟลเดอร์ lab_02 ของ GitHub repo RAE67_bio_ins โดยใช้ lab02.py, student_controller.py, plot_trial.py, requirements.txt และ tests/test_lab02.py</w:t>
+      </w:r>
+    </w:p>
+    <w:p>
+      <w:pPr/>
+      <w:r>
+        <w:t>แหล่งไฟล์: https://github.com/potiwat/RAE67_bio_ins/tree/main/lab_02 (repo เป็น private ต้องได้รับสิทธิ์เข้าถึงก่อน)</w:t>
       </w:r>
     </w:p>
     <w:p>
@@ -1155,7 +1161,7 @@
                 <w:color w:val="000000"/>
                 <w:sz w:val="18"/>
               </w:rPr>
-              <w:t>เวลาจน state ถูกต้องต่อเนื่องอย่างน้อย 0.5 s</w:t>
+              <w:t>เวลาจาก physical crossing จนเริ่มช่วง state ถูกต้องต่อเนื่อง 0.5 s รายงานค่ามากกว่าของ enter/exit</w:t>
             </w:r>
           </w:p>
         </w:tc>
@@ -2297,6 +2303,14 @@
         <w:pStyle w:val="ListBullet"/>
       </w:pPr>
       <w:r>
+        <w:t>Block diagram ของ sensorimotor loop ที่อธิบายทางข้อมูลและ feedback</w:t>
+      </w:r>
+    </w:p>
+    <w:p>
+      <w:pPr>
+        <w:pStyle w:val="ListBullet"/>
+      </w:pPr>
+      <w:r>
         <w:t>student_controller.py ที่เติม TODO พร้อม source code อื่นที่แก้</w:t>
       </w:r>
     </w:p>

</xml_diff>

<commit_message>
Run and diagnose student Lab 02 controllers
</commit_message>
<xml_diff>
--- a/lab_02/Lab02_Student_Manual_TH.docx
+++ b/lab_02/Lab02_Student_Manual_TH.docx
@@ -71,7 +71,7 @@
     <w:p>
       <w:pPr/>
       <w:r>
-        <w:t>ทำงานในโฟลเดอร์ lab_02 ของ GitHub repo RAE67_bio_ins โดยใช้ lab02.py, student_controller.py, plot_trial.py, requirements.txt และ tests/test_lab02.py</w:t>
+        <w:t>ทำงานในโฟลเดอร์ lab_02 ของ GitHub repo RAE67_bio_ins โดยใช้ lab02.py, student_controller.py, grade_submission.py, plot_trial.py, requirements.txt และ tests/</w:t>
       </w:r>
     </w:p>
     <w:p>
@@ -217,7 +217,7 @@
     <w:p>
       <w:pPr/>
       <w:r>
-        <w:t>ผลที่คาด: tests ผ่าน 6 รายการ หากไม่ผ่าน ให้จด error และแก้ก่อนเริ่มเก็บข้อมูล</w:t>
+        <w:t>ผลที่คาด: tests ผ่าน 12 รายการ หากไม่ผ่าน ให้จด error และแก้ก่อนเริ่มเก็บข้อมูล ชุดนี้ทดสอบตัวเชื่อม แต่ไม่ถือว่า TODO ของนักศึกษาเสร็จแล้ว</w:t>
       </w:r>
     </w:p>
     <w:p>
@@ -237,7 +237,7 @@
     <w:p>
       <w:pPr/>
       <w:r>
-        <w:t>student_controller.py เป็นแบบฝึกเติมฟังก์ชันแยกต่างหาก คำสั่งทดลองด้านล่างรัน implementation ใน lab02.py หากต้องการทดสอบโค้ดของกลุ่ม ให้ผู้สอนตรวจและเชื่อมฟังก์ชันของกลุ่มเข้ากับ experiment loop ก่อน</w:t>
+        <w:t>lab02.py เชื่อม StudentController เข้ากับ experiment loop แล้ว เมธอด TODO แต่ละตัวต้องคืนค่าที่คำนวณได้ โหมด reference ใช้ตัวอย่างใน lab02.py ส่วนโหมด student ใช้ไฟล์ที่ส่งด้วย --student-file</w:t>
       </w:r>
     </w:p>
     <w:tbl>
@@ -791,7 +791,45 @@
     <w:p>
       <w:pPr/>
       <w:r>
-        <w:t>ตรวจว่ามี run_config.json, summary_trials.csv, summary_aggregate.csv และ raw CSV ในโฟลเดอร์ trials เปิด run_config.json เพื่อบันทึก seed และ parameter ที่ใช้</w:t>
+        <w:t>หลังเติม TODO ครบ ให้ทดลอง controller ของกลุ่มด้วย input และ metric เดียวกัน แต่เก็บผลคนละโฟลเดอร์</w:t>
+      </w:r>
+    </w:p>
+    <w:p>
+      <w:pPr>
+        <w:spacing w:before="40" w:after="140"/>
+        <w:ind w:left="317"/>
+      </w:pPr>
+      <w:r>
+        <w:rPr>
+          <w:rFonts w:ascii="Consolas" w:hAnsi="Consolas"/>
+          <w:sz w:val="18"/>
+        </w:rPr>
+        <w:t>python lab02.py --controller-source student --student-file student_controller.py --protocol controller-comparison --out results\student_comparison</w:t>
+      </w:r>
+    </w:p>
+    <w:p>
+      <w:pPr>
+        <w:spacing w:before="40" w:after="140"/>
+        <w:ind w:left="317"/>
+      </w:pPr>
+      <w:r>
+        <w:rPr>
+          <w:rFonts w:ascii="Consolas" w:hAnsi="Consolas"/>
+          <w:sz w:val="18"/>
+        </w:rPr>
+        <w:t>python grade_submission.py --student-file student_controller.py --out results\student_grade.json</w:t>
+      </w:r>
+    </w:p>
+    <w:p>
+      <w:pPr/>
+      <w:r>
+        <w:t>grade_submission.py รายงาน PASS/FAIL ของ filter, threshold, hysteresis, proportional/clamp, invalid sample และเปรียบเทียบ trace C0–C3 กับ reference หาก TODO ยังไม่เสร็จจะคืน exit code 1 โดยยังไม่สร้างผลทดลองของโหมด student</w:t>
+      </w:r>
+    </w:p>
+    <w:p>
+      <w:pPr/>
+      <w:r>
+        <w:t>ตรวจว่ามี run_config.json, summary_trials.csv, summary_aggregate.csv และ raw CSV ในโฟลเดอร์ trials เปิด run_config.json เพื่อตรวจ seed, parameter, controller_source และ SHA-256 ของไฟล์นักศึกษา</w:t>
       </w:r>
     </w:p>
     <w:p>
@@ -2162,11 +2200,6 @@
       </w:r>
     </w:p>
     <w:p>
-      <w:r>
-        <w:br w:type="page"/>
-      </w:r>
-    </w:p>
-    <w:p>
       <w:pPr>
         <w:pStyle w:val="Heading1"/>
       </w:pPr>
@@ -2283,6 +2316,12 @@
       </w:r>
     </w:p>
     <w:p>
+      <w:pPr/>
+      <w:r>
+        <w:t>ผล PASS/FAIL จาก grade_submission.py ใช้ตรวจการทำงานของโค้ดเท่านั้น ไม่แทนคะแนน 20 คะแนน ผู้สอนยังต้องตรวจ block diagram, protocol, การวิเคราะห์และการตีความ</w:t>
+      </w:r>
+    </w:p>
+    <w:p>
       <w:pPr>
         <w:pStyle w:val="Heading1"/>
       </w:pPr>
@@ -2312,6 +2351,14 @@
       </w:pPr>
       <w:r>
         <w:t>student_controller.py ที่เติม TODO พร้อม source code อื่นที่แก้</w:t>
+      </w:r>
+    </w:p>
+    <w:p>
+      <w:pPr>
+        <w:pStyle w:val="ListBullet"/>
+      </w:pPr>
+      <w:r>
+        <w:t>ผลตรวจจาก grade_submission.py และ run_config.json ของโหมด student</w:t>
       </w:r>
     </w:p>
     <w:p>

</xml_diff>